<commit_message>
Iskustvo: održavanje servera, mreža i video nadzora u JP „ONSA“
Nova stavka "Održavanje servera, internet i telefonske mreže te video
nadzora" u portfoliju i u CV-u (PDF i Word izvornik). CV je i dalje na
jednoj stranici.

Co-Authored-By: Claude Opus 5.5 <noreply@anthropic.com>
Claude-Session: https://claude.ai/code/session_0144qu7uL1YmC4gYVFNsieVp
</commit_message>
<xml_diff>
--- a/cv/Haris-Milavica-CV.docx
+++ b/cv/Haris-Milavica-CV.docx
@@ -45,7 +45,7 @@
         </w:rPr>
         <w:t xml:space="preserve">  ·  </w:t>
       </w:r>
-      <w:hyperlink w:history="1" r:id="rIdinunj7ri6-v2wikrbl_bd">
+      <w:hyperlink w:history="1" r:id="rIdwnuf77ipjq1xiuf_hwq6i">
         <w:r>
           <w:rPr>
             <w:color w:val="800000"/>
@@ -74,7 +74,7 @@
       <w:r>
         <w:t xml:space="preserve">Portfolio: </w:t>
       </w:r>
-      <w:hyperlink w:history="1" r:id="rIdpuud4l0risftii1w2-rvt">
+      <w:hyperlink w:history="1" r:id="rIde1r96w9e4udqy7cw654rp">
         <w:r>
           <w:rPr>
             <w:color w:val="800000"/>
@@ -95,7 +95,7 @@
       <w:r>
         <w:t xml:space="preserve">GitHub: </w:t>
       </w:r>
-      <w:hyperlink w:history="1" r:id="rIdzsgdysi94uyij5gbsohvw">
+      <w:hyperlink w:history="1" r:id="rId0ihnl5xqrwyuml6bpmfhb">
         <w:r>
           <w:rPr>
             <w:color w:val="800000"/>
@@ -538,7 +538,7 @@
         </w:rPr>
         <w:t xml:space="preserve">  ·  </w:t>
       </w:r>
-      <w:hyperlink w:history="1" r:id="rIdneywwwortztc7rhx7zkhi">
+      <w:hyperlink w:history="1" r:id="rIdktxu1-3mii9u2smvbmxni">
         <w:r>
           <w:rPr>
             <w:color w:val="800000"/>
@@ -624,6 +624,19 @@
       </w:pPr>
       <w:r>
         <w:t xml:space="preserve">Održavanje sistema za naplatu parkinga i sportske dvorane s pratećom infrastrukturom.</w:t>
+      </w:r>
+    </w:p>
+    <w:p>
+      <w:pPr>
+        <w:pStyle w:val="ListParagraph"/>
+        <w:numPr>
+          <w:ilvl w:val="0"/>
+          <w:numId w:val="2"/>
+        </w:numPr>
+        <w:spacing w:after="20" w:before="0" w:line="252"/>
+      </w:pPr>
+      <w:r>
+        <w:t xml:space="preserve">Održavanje servera, internet i telefonske mreže te video nadzora.</w:t>
       </w:r>
     </w:p>
     <w:p>

</xml_diff>

<commit_message>
CV: hmcode.ba u kontaktima, bez ugostiteljstva
U zaglavlju CV-a je dodan link na web stranicu hmcode.ba (prije
portfolija i GitHuba), a iz radnog iskustva je uklonjena stavka
"Ugostiteljstvo i turizam". Izmijenjeni su PDF i Word izvornik.

Co-Authored-By: Claude Opus 5.5 <noreply@anthropic.com>
Claude-Session: https://claude.ai/code/session_0144qu7uL1YmC4gYVFNsieVp
</commit_message>
<xml_diff>
--- a/cv/Haris-Milavica-CV.docx
+++ b/cv/Haris-Milavica-CV.docx
@@ -45,7 +45,7 @@
         </w:rPr>
         <w:t xml:space="preserve">  ·  </w:t>
       </w:r>
-      <w:hyperlink w:history="1" r:id="rIdwnuf77ipjq1xiuf_hwq6i">
+      <w:hyperlink w:history="1" r:id="rIdd5r9kvwavdliycik-zqhj">
         <w:r>
           <w:rPr>
             <w:color w:val="800000"/>
@@ -72,9 +72,30 @@
         <w:spacing w:after="0" w:before="0"/>
       </w:pPr>
       <w:r>
+        <w:t xml:space="preserve">Web: </w:t>
+      </w:r>
+      <w:hyperlink w:history="1" r:id="rIdeicjjzchrpy_lixz6ff6c">
+        <w:r>
+          <w:rPr>
+            <w:color w:val="800000"/>
+            <w:sz w:val="20"/>
+            <w:szCs w:val="20"/>
+          </w:rPr>
+          <w:t xml:space="preserve">hmcode.ba</w:t>
+        </w:r>
+      </w:hyperlink>
+      <w:r>
+        <w:rPr>
+          <w:color w:val="999999"/>
+          <w:sz w:val="20"/>
+          <w:szCs w:val="20"/>
+        </w:rPr>
+        <w:t xml:space="preserve">  ·  </w:t>
+      </w:r>
+      <w:r>
         <w:t xml:space="preserve">Portfolio: </w:t>
       </w:r>
-      <w:hyperlink w:history="1" r:id="rIde1r96w9e4udqy7cw654rp">
+      <w:hyperlink w:history="1" r:id="rIdjrpkfbl9r9f3qoqzqqfea">
         <w:r>
           <w:rPr>
             <w:color w:val="800000"/>
@@ -95,7 +116,7 @@
       <w:r>
         <w:t xml:space="preserve">GitHub: </w:t>
       </w:r>
-      <w:hyperlink w:history="1" r:id="rId0ihnl5xqrwyuml6bpmfhb">
+      <w:hyperlink w:history="1" r:id="rIdjs6azhj52het7irkq7v2o">
         <w:r>
           <w:rPr>
             <w:color w:val="800000"/>
@@ -538,7 +559,7 @@
         </w:rPr>
         <w:t xml:space="preserve">  ·  </w:t>
       </w:r>
-      <w:hyperlink w:history="1" r:id="rIdktxu1-3mii9u2smvbmxni">
+      <w:hyperlink w:history="1" r:id="rId3wbm4krbeji9axzhvxigk">
         <w:r>
           <w:rPr>
             <w:color w:val="800000"/>
@@ -701,41 +722,6 @@
       </w:pPr>
       <w:r>
         <w:t xml:space="preserve">Učešće u većini faza proizvodnje, od poluproizvoda do gotovog proizvoda.</w:t>
-      </w:r>
-    </w:p>
-    <w:p>
-      <w:pPr>
-        <w:keepNext/>
-        <w:tabs>
-          <w:tab w:val="right" w:pos="10206"/>
-        </w:tabs>
-        <w:spacing w:after="0" w:before="90" w:line="252"/>
-      </w:pPr>
-      <w:r>
-        <w:rPr>
-          <w:b/>
-          <w:bCs/>
-        </w:rPr>
-        <w:t xml:space="preserve">Ugostiteljstvo i turizam</w:t>
-      </w:r>
-      <w:r>
-        <w:rPr>
-          <w:color w:val="444444"/>
-        </w:rPr>
-        <w:t xml:space="preserve">	2016 – 2017, 2024 – 2025</w:t>
-      </w:r>
-    </w:p>
-    <w:p>
-      <w:pPr>
-        <w:pStyle w:val="ListParagraph"/>
-        <w:numPr>
-          <w:ilvl w:val="0"/>
-          <w:numId w:val="2"/>
-        </w:numPr>
-        <w:spacing w:after="20" w:before="0" w:line="252"/>
-      </w:pPr>
-      <w:r>
-        <w:t xml:space="preserve">Konobar i šanker u više ugostiteljskih objekata, pomoćnik u kuhinji, turistički pratilac („ZOOM TRAVEL“ d.o.o.).</w:t>
       </w:r>
     </w:p>
     <w:p>

</xml_diff>

<commit_message>
CV: info@hmcode.ba uz privatnu email adresu
U zaglavlju CV-a je pored haris.milavica.hm@gmail.com dodana i
adresa info@hmcode.ba (link mailto). Izmijenjeni su PDF i Word izvornik.

Co-Authored-By: Claude Opus 5.5 <noreply@anthropic.com>
Claude-Session: https://claude.ai/code/session_0144qu7uL1YmC4gYVFNsieVp
</commit_message>
<xml_diff>
--- a/cv/Haris-Milavica-CV.docx
+++ b/cv/Haris-Milavica-CV.docx
@@ -45,7 +45,7 @@
         </w:rPr>
         <w:t xml:space="preserve">  ·  </w:t>
       </w:r>
-      <w:hyperlink w:history="1" r:id="rIdd5r9kvwavdliycik-zqhj">
+      <w:hyperlink w:history="1" r:id="rIdgfbe0vjp-u-e5d3u5ahvs">
         <w:r>
           <w:rPr>
             <w:color w:val="800000"/>
@@ -63,6 +63,24 @@
         </w:rPr>
         <w:t xml:space="preserve">  ·  </w:t>
       </w:r>
+      <w:hyperlink w:history="1" r:id="rIdi6sptwrsyr2zk2elagiaf">
+        <w:r>
+          <w:rPr>
+            <w:color w:val="800000"/>
+            <w:sz w:val="20"/>
+            <w:szCs w:val="20"/>
+          </w:rPr>
+          <w:t xml:space="preserve">info@hmcode.ba</w:t>
+        </w:r>
+      </w:hyperlink>
+      <w:r>
+        <w:rPr>
+          <w:color w:val="999999"/>
+          <w:sz w:val="20"/>
+          <w:szCs w:val="20"/>
+        </w:rPr>
+        <w:t xml:space="preserve">  ·  </w:t>
+      </w:r>
       <w:r>
         <w:t xml:space="preserve">Datum rođenja: 01. 02. 1994.</w:t>
       </w:r>
@@ -74,7 +92,7 @@
       <w:r>
         <w:t xml:space="preserve">Web: </w:t>
       </w:r>
-      <w:hyperlink w:history="1" r:id="rIdeicjjzchrpy_lixz6ff6c">
+      <w:hyperlink w:history="1" r:id="rIdxr2w-nengfknicd_nhagv">
         <w:r>
           <w:rPr>
             <w:color w:val="800000"/>
@@ -95,7 +113,7 @@
       <w:r>
         <w:t xml:space="preserve">Portfolio: </w:t>
       </w:r>
-      <w:hyperlink w:history="1" r:id="rIdjrpkfbl9r9f3qoqzqqfea">
+      <w:hyperlink w:history="1" r:id="rIde2zlz6xblikdgdqizo0s5">
         <w:r>
           <w:rPr>
             <w:color w:val="800000"/>
@@ -116,7 +134,7 @@
       <w:r>
         <w:t xml:space="preserve">GitHub: </w:t>
       </w:r>
-      <w:hyperlink w:history="1" r:id="rIdjs6azhj52het7irkq7v2o">
+      <w:hyperlink w:history="1" r:id="rIdziajby7aeyd1disi2ojoy">
         <w:r>
           <w:rPr>
             <w:color w:val="800000"/>
@@ -559,7 +577,7 @@
         </w:rPr>
         <w:t xml:space="preserve">  ·  </w:t>
       </w:r>
-      <w:hyperlink w:history="1" r:id="rId3wbm4krbeji9axzhvxigk">
+      <w:hyperlink w:history="1" r:id="rIdjl-xx8wkbk6ep4cp-dx6s">
         <w:r>
           <w:rPr>
             <w:color w:val="800000"/>

</xml_diff>